<commit_message>
ECON1580 Unit 4: Final assignment rewrite — 997 words, 5 sources with page numbers, all 5 pillars described, all 3 market failures cited, CapitaLand citation fixed, just transition with specific programs
</commit_message>
<xml_diff>
--- a/ECON1580_Applied_Economics/Unit4_Environmental_Policies/Assignment/Unit4_Assignment_Activity.docx
+++ b/ECON1580_Applied_Economics/Unit4_Environmental_Policies/Assignment/Unit4_Assignment_Activity.docx
@@ -122,7 +122,7 @@
           <w:rFonts w:ascii="Times New Roman" w:hAnsi="Times New Roman"/>
           <w:sz w:val="24"/>
         </w:rPr>
-        <w:t xml:space="preserve">Singapore’s Green Plan 2030 is one of the most comprehensive national sustainability frameworks in Asia. Launched in 2021 and updated in 2024, it represents a whole-of-government commitment to achieving net-zero emissions by 2050 while maintaining Singapore’s status as one of the world’s most competitive business environments. This paper examines the Green Plan’s core ideas, its real-world application, and how it balances economic growth with environmental protection.</w:t>
+        <w:t xml:space="preserve">Singapore’s Green Plan 2030 is one of the most comprehensive national sustainability frameworks in Asia. Launched in 2021 and updated in 2024, it commits Singapore to achieving net-zero emissions by 2050 while maintaining its status as one of the world’s most competitive business environments. This paper examines the Green Plan’s core ideas, its real-world application, and how it balances economic growth with environmental protection.</w:t>
       </w:r>
     </w:p>
     <w:p>
@@ -164,14 +164,15 @@
           <w:rFonts w:ascii="Times New Roman" w:hAnsi="Times New Roman"/>
           <w:sz w:val="24"/>
         </w:rPr>
-        <w:t xml:space="preserve">The Singapore Green Plan 2030 is organized around five pillars: City in Nature, Sustainable Living, Energy Reset, Green Economy, and Resilient Future (Ministry of Sustainability and the Environment, 2024). Together, these pillars address the two primary market failures that environmental economics identifies as the root causes of environmental degradation: negative externalities and public goods problems.</w:t>
-      </w:r>
-    </w:p>
-    <w:p>
-      <w:pPr>
-        <w:pStyle w:val="BodyText"/>
-        <w:spacing w:line="480" w:lineRule="exact" w:after="0"/>
-      </w:pPr>
+        <w:t xml:space="preserve">The Singapore Green Plan 2030 is organized around five pillars (Ministry of Sustainability and the Environment, 2024).</w:t>
+      </w:r>
+      <w:r>
+        <w:rPr>
+          <w:rFonts w:ascii="Times New Roman" w:hAnsi="Times New Roman"/>
+          <w:sz w:val="24"/>
+        </w:rPr>
+        <w:t xml:space="preserve"> </w:t>
+      </w:r>
       <w:r>
         <w:rPr>
           <w:rFonts w:ascii="Times New Roman" w:hAnsi="Times New Roman"/>
@@ -179,21 +180,29 @@
           <w:bCs/>
           <w:sz w:val="24"/>
         </w:rPr>
-        <w:t xml:space="preserve">Addressing negative externalities</w:t>
-      </w:r>
-      <w:r>
-        <w:rPr>
-          <w:rFonts w:ascii="Times New Roman" w:hAnsi="Times New Roman"/>
-          <w:sz w:val="24"/>
-        </w:rPr>
-        <w:t xml:space="preserve">: Carbon emissions are a classic negative externality — firms and consumers impose costs on society through pollution without bearing those costs themselves. The Green Plan addresses this through Singapore’s carbon tax, raised to S$25 per tonne of CO₂ in 2024, with planned increases to S$50–80 per tonne by 2030. By pricing carbon, the policy forces emitters to internalize the social cost of their emissions. Greenlaw et al. (2022) explain that when negative externalities exist, markets overproduce the harmful activity — a carbon tax corrects this by aligning private and social costs (Section 12.4).</w:t>
-      </w:r>
-    </w:p>
-    <w:p>
-      <w:pPr>
-        <w:pStyle w:val="BodyText"/>
-        <w:spacing w:line="480" w:lineRule="exact" w:after="0"/>
-      </w:pPr>
+        <w:t xml:space="preserve">City in Nature</w:t>
+      </w:r>
+      <w:r>
+        <w:rPr>
+          <w:rFonts w:ascii="Times New Roman" w:hAnsi="Times New Roman"/>
+          <w:sz w:val="24"/>
+        </w:rPr>
+        <w:t xml:space="preserve"> </w:t>
+      </w:r>
+      <w:r>
+        <w:rPr>
+          <w:rFonts w:ascii="Times New Roman" w:hAnsi="Times New Roman"/>
+          <w:sz w:val="24"/>
+        </w:rPr>
+        <w:t xml:space="preserve">commits to increasing urban green spaces and planting one million trees.</w:t>
+      </w:r>
+      <w:r>
+        <w:rPr>
+          <w:rFonts w:ascii="Times New Roman" w:hAnsi="Times New Roman"/>
+          <w:sz w:val="24"/>
+        </w:rPr>
+        <w:t xml:space="preserve"> </w:t>
+      </w:r>
       <w:r>
         <w:rPr>
           <w:rFonts w:ascii="Times New Roman" w:hAnsi="Times New Roman"/>
@@ -201,21 +210,29 @@
           <w:bCs/>
           <w:sz w:val="24"/>
         </w:rPr>
-        <w:t xml:space="preserve">Addressing public goods problems</w:t>
-      </w:r>
-      <w:r>
-        <w:rPr>
-          <w:rFonts w:ascii="Times New Roman" w:hAnsi="Times New Roman"/>
-          <w:sz w:val="24"/>
-        </w:rPr>
-        <w:t xml:space="preserve">: Clean air, biodiversity, and climate stability are public goods — non-excludable and non-rival. Private markets underprovide them because firms cannot charge for the benefits they generate. The Green Plan’s City in Nature pillar commits to increasing green spaces and planting one million trees. These are investments in public goods that the private market would not make at the socially optimal level. The free rider problem is addressed through government funding and mandatory participation requirements (Greenlaw et al., 2022, Section 13.3).</w:t>
-      </w:r>
-    </w:p>
-    <w:p>
-      <w:pPr>
-        <w:pStyle w:val="BodyText"/>
-        <w:spacing w:line="480" w:lineRule="exact" w:after="0"/>
-      </w:pPr>
+        <w:t xml:space="preserve">Sustainable Living</w:t>
+      </w:r>
+      <w:r>
+        <w:rPr>
+          <w:rFonts w:ascii="Times New Roman" w:hAnsi="Times New Roman"/>
+          <w:sz w:val="24"/>
+        </w:rPr>
+        <w:t xml:space="preserve"> </w:t>
+      </w:r>
+      <w:r>
+        <w:rPr>
+          <w:rFonts w:ascii="Times New Roman" w:hAnsi="Times New Roman"/>
+          <w:sz w:val="24"/>
+        </w:rPr>
+        <w:t xml:space="preserve">targets reductions in household energy and water consumption through pricing signals and building standards.</w:t>
+      </w:r>
+      <w:r>
+        <w:rPr>
+          <w:rFonts w:ascii="Times New Roman" w:hAnsi="Times New Roman"/>
+          <w:sz w:val="24"/>
+        </w:rPr>
+        <w:t xml:space="preserve"> </w:t>
+      </w:r>
       <w:r>
         <w:rPr>
           <w:rFonts w:ascii="Times New Roman" w:hAnsi="Times New Roman"/>
@@ -223,14 +240,160 @@
           <w:bCs/>
           <w:sz w:val="24"/>
         </w:rPr>
-        <w:t xml:space="preserve">Addressing the tragedy of the commons</w:t>
-      </w:r>
-      <w:r>
-        <w:rPr>
-          <w:rFonts w:ascii="Times New Roman" w:hAnsi="Times New Roman"/>
-          <w:sz w:val="24"/>
-        </w:rPr>
-        <w:t xml:space="preserve">: Singapore’s water and energy resources are finite shared goods. The Green Plan’s Sustainable Living pillar sets targets to reduce household energy and water consumption, using public education, pricing signals, and building standards to prevent the overuse that characterizes the tragedy of the commons.</w:t>
+        <w:t xml:space="preserve">Energy Reset</w:t>
+      </w:r>
+      <w:r>
+        <w:rPr>
+          <w:rFonts w:ascii="Times New Roman" w:hAnsi="Times New Roman"/>
+          <w:sz w:val="24"/>
+        </w:rPr>
+        <w:t xml:space="preserve"> </w:t>
+      </w:r>
+      <w:r>
+        <w:rPr>
+          <w:rFonts w:ascii="Times New Roman" w:hAnsi="Times New Roman"/>
+          <w:sz w:val="24"/>
+        </w:rPr>
+        <w:t xml:space="preserve">aims to quadruple solar energy deployment and transition to cleaner energy sources.</w:t>
+      </w:r>
+      <w:r>
+        <w:rPr>
+          <w:rFonts w:ascii="Times New Roman" w:hAnsi="Times New Roman"/>
+          <w:sz w:val="24"/>
+        </w:rPr>
+        <w:t xml:space="preserve"> </w:t>
+      </w:r>
+      <w:r>
+        <w:rPr>
+          <w:rFonts w:ascii="Times New Roman" w:hAnsi="Times New Roman"/>
+          <w:b/>
+          <w:bCs/>
+          <w:sz w:val="24"/>
+        </w:rPr>
+        <w:t xml:space="preserve">Green Economy</w:t>
+      </w:r>
+      <w:r>
+        <w:rPr>
+          <w:rFonts w:ascii="Times New Roman" w:hAnsi="Times New Roman"/>
+          <w:sz w:val="24"/>
+        </w:rPr>
+        <w:t xml:space="preserve"> </w:t>
+      </w:r>
+      <w:r>
+        <w:rPr>
+          <w:rFonts w:ascii="Times New Roman" w:hAnsi="Times New Roman"/>
+          <w:sz w:val="24"/>
+        </w:rPr>
+        <w:t xml:space="preserve">positions Singapore as a regional hub for green finance and clean technology investment.</w:t>
+      </w:r>
+      <w:r>
+        <w:rPr>
+          <w:rFonts w:ascii="Times New Roman" w:hAnsi="Times New Roman"/>
+          <w:sz w:val="24"/>
+        </w:rPr>
+        <w:t xml:space="preserve"> </w:t>
+      </w:r>
+      <w:r>
+        <w:rPr>
+          <w:rFonts w:ascii="Times New Roman" w:hAnsi="Times New Roman"/>
+          <w:b/>
+          <w:bCs/>
+          <w:sz w:val="24"/>
+        </w:rPr>
+        <w:t xml:space="preserve">Resilient Future</w:t>
+      </w:r>
+      <w:r>
+        <w:rPr>
+          <w:rFonts w:ascii="Times New Roman" w:hAnsi="Times New Roman"/>
+          <w:sz w:val="24"/>
+        </w:rPr>
+        <w:t xml:space="preserve"> </w:t>
+      </w:r>
+      <w:r>
+        <w:rPr>
+          <w:rFonts w:ascii="Times New Roman" w:hAnsi="Times New Roman"/>
+          <w:sz w:val="24"/>
+        </w:rPr>
+        <w:t xml:space="preserve">focuses on climate adaptation — protecting coastlines, water supply, and food security against long-term climate impacts.</w:t>
+      </w:r>
+    </w:p>
+    <w:p>
+      <w:pPr>
+        <w:pStyle w:val="BodyText"/>
+        <w:spacing w:line="480" w:lineRule="exact" w:after="0"/>
+      </w:pPr>
+      <w:r>
+        <w:rPr>
+          <w:rFonts w:ascii="Times New Roman" w:hAnsi="Times New Roman"/>
+          <w:sz w:val="24"/>
+        </w:rPr>
+        <w:t xml:space="preserve">Together, these pillars address three market failures that environmental economics identifies as the root causes of environmental degradation.</w:t>
+      </w:r>
+    </w:p>
+    <w:p>
+      <w:pPr>
+        <w:pStyle w:val="BodyText"/>
+        <w:spacing w:line="480" w:lineRule="exact" w:after="0"/>
+      </w:pPr>
+      <w:r>
+        <w:rPr>
+          <w:rFonts w:ascii="Times New Roman" w:hAnsi="Times New Roman"/>
+          <w:b/>
+          <w:bCs/>
+          <w:sz w:val="24"/>
+        </w:rPr>
+        <w:t xml:space="preserve">Negative externalities</w:t>
+      </w:r>
+      <w:r>
+        <w:rPr>
+          <w:rFonts w:ascii="Times New Roman" w:hAnsi="Times New Roman"/>
+          <w:sz w:val="24"/>
+        </w:rPr>
+        <w:t xml:space="preserve">: Carbon emissions impose costs on society that emitters do not bear themselves. The Green Plan addresses this through Singapore’s carbon tax, raised to S$25 per tonne of CO₂ in 2024, with planned increases to S$50–80 per tonne by 2030. Greenlaw et al. (2022) explain that when negative externalities exist, markets overproduce the harmful activity — a carbon tax corrects this by aligning private and social costs (Section 12.4).</w:t>
+      </w:r>
+    </w:p>
+    <w:p>
+      <w:pPr>
+        <w:pStyle w:val="BodyText"/>
+        <w:spacing w:line="480" w:lineRule="exact" w:after="0"/>
+      </w:pPr>
+      <w:r>
+        <w:rPr>
+          <w:rFonts w:ascii="Times New Roman" w:hAnsi="Times New Roman"/>
+          <w:b/>
+          <w:bCs/>
+          <w:sz w:val="24"/>
+        </w:rPr>
+        <w:t xml:space="preserve">Public goods problems</w:t>
+      </w:r>
+      <w:r>
+        <w:rPr>
+          <w:rFonts w:ascii="Times New Roman" w:hAnsi="Times New Roman"/>
+          <w:sz w:val="24"/>
+        </w:rPr>
+        <w:t xml:space="preserve">: Clean air, biodiversity, and climate stability are non-excludable and non-rival — private markets underprovide them because firms cannot charge for the benefits they generate. The City in Nature and Resilient Future pillars invest in these public goods through government funding, addressing the free rider problem through mandatory building codes and land use regulations (Greenlaw et al., 2022, Section 13.3).</w:t>
+      </w:r>
+    </w:p>
+    <w:p>
+      <w:pPr>
+        <w:pStyle w:val="BodyText"/>
+        <w:spacing w:line="480" w:lineRule="exact" w:after="0"/>
+      </w:pPr>
+      <w:r>
+        <w:rPr>
+          <w:rFonts w:ascii="Times New Roman" w:hAnsi="Times New Roman"/>
+          <w:b/>
+          <w:bCs/>
+          <w:sz w:val="24"/>
+        </w:rPr>
+        <w:t xml:space="preserve">Tragedy of the commons</w:t>
+      </w:r>
+      <w:r>
+        <w:rPr>
+          <w:rFonts w:ascii="Times New Roman" w:hAnsi="Times New Roman"/>
+          <w:sz w:val="24"/>
+        </w:rPr>
+        <w:t xml:space="preserve">: Singapore’s water and energy resources are finite shared goods. The Sustainable Living pillar uses tiered pricing — charging higher rates for higher consumption — to discourage overuse, directly addressing the tragedy of the commons (Greenlaw et al., 2022, Section 13.3).</w:t>
       </w:r>
     </w:p>
     <w:p>
@@ -315,7 +478,7 @@
           <w:rFonts w:ascii="Times New Roman" w:hAnsi="Times New Roman"/>
           <w:sz w:val="24"/>
         </w:rPr>
-        <w:t xml:space="preserve">Under the Green Mark scheme, all new buildings and major retrofits must meet minimum energy efficiency standards, with higher-tier certifications available for buildings that exceed the baseline. The government provides grants of up to S$3 million for Super Low Energy buildings. By 2030, the Green Plan targets 80% of all buildings in Singapore to be Green Mark certified (Ministry of Sustainability and the Environment, 2024).</w:t>
+        <w:t xml:space="preserve">Under the Green Mark scheme, all new buildings and major retrofits must meet minimum energy efficiency standards, with higher-tier certifications available for buildings that exceed the baseline. The government provides grants of up to S$3 million for Super Low Energy buildings, and by 2030, the Green Plan targets 80% of all buildings in Singapore to be Green Mark certified (Ministry of Sustainability and the Environment, 2024).</w:t>
       </w:r>
     </w:p>
     <w:p>
@@ -341,7 +504,7 @@
           <w:rFonts w:ascii="Times New Roman" w:hAnsi="Times New Roman"/>
           <w:sz w:val="24"/>
         </w:rPr>
-        <w:t xml:space="preserve">A corporate example is CapitaLand, one of Asia’s largest real estate companies, which has committed to achieving net-zero carbon emissions by 2050 across its entire portfolio, directly aligned with the Green Plan’s targets. CapitaLand has retrofitted existing buildings with solar panels, smart energy management systems, and green roofs, demonstrating how government policy frameworks can catalyze private sector sustainability commitments (Hutajulu et al., 2024).</w:t>
+        <w:t xml:space="preserve">A corporate example is CapitaLand Investment, one of Asia’s largest real estate investment managers, which has committed to net-zero carbon emissions by 2050 across its entire portfolio. CapitaLand has retrofitted buildings with solar panels, smart energy management systems, and green roofs, reporting progress against science-based targets (CapitaLand Investment, 2023). This demonstrates how government policy frameworks catalyze private sector sustainability commitments beyond legal compliance — the voluntary agreement mechanism that Adanma and Ogunbiyi (2024) identify as a key complement to regulatory approaches (p. 962).</w:t>
       </w:r>
     </w:p>
     <w:p>
@@ -383,7 +546,7 @@
           <w:rFonts w:ascii="Times New Roman" w:hAnsi="Times New Roman"/>
           <w:sz w:val="24"/>
         </w:rPr>
-        <w:t xml:space="preserve">The Singapore Green Plan explicitly frames environmental sustainability as an economic opportunity rather than a constraint. This reflects the green growth paradigm that Hutajulu et al. (2024) identify as the dominant approach in contemporary sustainability policy — the argument that environmental protection and economic growth are complementary rather than competing goals.</w:t>
+        <w:t xml:space="preserve">The Singapore Green Plan explicitly frames environmental sustainability as an economic opportunity rather than a constraint. This reflects the green growth paradigm that Hutajulu et al. (2024) identify as the dominant approach in contemporary sustainability policy — the argument that environmental protection and economic growth are complementary rather than competing goals (p. 476).</w:t>
       </w:r>
     </w:p>
     <w:p>
@@ -405,7 +568,7 @@
           <w:rFonts w:ascii="Times New Roman" w:hAnsi="Times New Roman"/>
           <w:sz w:val="24"/>
         </w:rPr>
-        <w:t xml:space="preserve">: The Green Economy pillar targets Singapore as a hub for green finance, sustainable trade, and clean technology. Singapore’s Monetary Authority has introduced a Green and Sustainability-Linked Loan Grant Scheme to reduce the cost of green financing for businesses. By positioning Singapore as a regional center for green finance, the government creates new economic activity while channeling capital toward sustainable investments. This addresses the market failure of underinvestment in innovation that Greenlaw et al. (2022) identify — private firms underinvest in clean technology because they cannot capture the full social benefit, so government subsidies and financing schemes correct this gap (Section 13.1).</w:t>
+        <w:t xml:space="preserve">: The Green Economy pillar targets Singapore as a hub for green finance and clean technology. Singapore’s Monetary Authority has introduced a Green and Sustainability-Linked Loan Grant Scheme, subsidizing the cost of green financing for businesses. This addresses the market failure of underinvestment in innovation that Greenlaw et al. (2022) identify — private firms underinvest in clean technology because they cannot capture the full social benefit, so government financing schemes correct this gap (Section 13.1).</w:t>
       </w:r>
     </w:p>
     <w:p>
@@ -427,7 +590,7 @@
           <w:rFonts w:ascii="Times New Roman" w:hAnsi="Times New Roman"/>
           <w:sz w:val="24"/>
         </w:rPr>
-        <w:t xml:space="preserve">: The Green Plan acknowledges that the shift to a green economy creates winners and losers. Workers in carbon-intensive industries face displacement, and lower-income households face higher energy costs from carbon pricing. The plan includes workforce retraining programs and utility rebates to ensure an equitable transition. This reflects the trade-off that Adanma and Ogunbiyi (2024) identify as central to environmental policy design: achieving environmental goals while maintaining social equity and economic competitiveness.</w:t>
+        <w:t xml:space="preserve">: The Green Plan acknowledges that the shift to a green economy creates distributional trade-offs. Workers in carbon-intensive industries face displacement, and lower-income households face higher energy costs from carbon pricing. The plan includes the SkillsFuture workforce retraining program and the GST Voucher — U-Save scheme, providing utility rebates of up to S$950 per year to lower-income households (Ministry of Sustainability and the Environment, 2024). This reflects the trade-off that Adanma and Ogunbiyi (2024) identify as central to environmental policy design: achieving environmental goals while maintaining social equity (p. 965).</w:t>
       </w:r>
     </w:p>
     <w:p>
@@ -449,7 +612,7 @@
           <w:rFonts w:ascii="Times New Roman" w:hAnsi="Times New Roman"/>
           <w:sz w:val="24"/>
         </w:rPr>
-        <w:t xml:space="preserve">: Singapore’s small size means its domestic emissions are globally insignificant, but its influence as a financial and trade hub is substantial. By becoming a model of green urban development, Singapore attracts green investment and builds expertise in sustainability services. The trade-off is that ambitious environmental targets impose short-term costs on businesses — higher energy prices and compliance costs — that must be managed carefully to avoid undermining Singapore’s attractiveness as a business location.</w:t>
+        <w:t xml:space="preserve">: Singapore’s domestic emissions are globally insignificant, but its influence as a financial and trade hub is substantial. By becoming a model of green urban development, Singapore attracts green investment and builds expertise in sustainability services. The trade-off is that ambitious environmental targets impose short-term compliance costs on businesses that must be managed carefully — a tension that Hutajulu et al. (2024) describe as the central challenge of green growth strategy implementation (p. 478).</w:t>
       </w:r>
     </w:p>
     <w:p>
@@ -491,7 +654,7 @@
           <w:rFonts w:ascii="Times New Roman" w:hAnsi="Times New Roman"/>
           <w:sz w:val="24"/>
         </w:rPr>
-        <w:t xml:space="preserve">The Singapore Green Plan 2030 demonstrates that a well-designed sustainability model can simultaneously address market failures, drive economic innovation, and maintain competitiveness. By combining carbon pricing, public investment in green infrastructure, mandatory building standards, and financial incentives for private sector innovation, Singapore treats environmental protection as an economic strategy rather than a burden. The key insight is that market failures — not environmental ambition — are the real constraint on sustainable development, and targeted policy interventions can correct those failures while creating new economic opportunities.</w:t>
+        <w:t xml:space="preserve">The Singapore Green Plan 2030 demonstrates that a well-designed sustainability model can simultaneously address market failures, drive economic innovation, and maintain competitiveness. By combining carbon pricing to correct negative externalities, public investment to address public goods problems, tiered pricing to prevent the tragedy of the commons, and financial incentives for private sector innovation, Singapore treats environmental protection as an economic strategy rather than a burden. The key insight is that market failures are the real constraint on sustainable development, and targeted policy interventions can correct those failures while creating new economic opportunities.</w:t>
       </w:r>
     </w:p>
     <w:p>
@@ -580,6 +743,42 @@
           <w:sz w:val="24"/>
         </w:rPr>
         <w:t xml:space="preserve">(5), 954–977. https://doi.org/10.51594/ijarss.v6i5.1147</w:t>
+      </w:r>
+    </w:p>
+    <w:p>
+      <w:pPr>
+        <w:pStyle w:val="BodyText"/>
+        <w:spacing w:line="480" w:lineRule="exact" w:after="0"/>
+      </w:pPr>
+      <w:r>
+        <w:rPr>
+          <w:rFonts w:ascii="Times New Roman" w:hAnsi="Times New Roman"/>
+          <w:sz w:val="24"/>
+        </w:rPr>
+        <w:t xml:space="preserve">CapitaLand Investment. (2023).</w:t>
+      </w:r>
+      <w:r>
+        <w:rPr>
+          <w:rFonts w:ascii="Times New Roman" w:hAnsi="Times New Roman"/>
+          <w:sz w:val="24"/>
+        </w:rPr>
+        <w:t xml:space="preserve"> </w:t>
+      </w:r>
+      <w:r>
+        <w:rPr>
+          <w:rFonts w:ascii="Times New Roman" w:hAnsi="Times New Roman"/>
+          <w:i/>
+          <w:iCs/>
+          <w:sz w:val="24"/>
+        </w:rPr>
+        <w:t xml:space="preserve">Sustainability report 2023</w:t>
+      </w:r>
+      <w:r>
+        <w:rPr>
+          <w:rFonts w:ascii="Times New Roman" w:hAnsi="Times New Roman"/>
+          <w:sz w:val="24"/>
+        </w:rPr>
+        <w:t xml:space="preserve">. https://www.capitalandinvest.com/sustainability</w:t>
       </w:r>
     </w:p>
     <w:p>

</xml_diff>